<commit_message>
Refactor Secure Product API for production
</commit_message>
<xml_diff>
--- a/Secure_Product_API_Documentation.docx
+++ b/Secure_Product_API_Documentation.docx
@@ -84,10 +84,7 @@
     </w:p>
     <w:p>
       <w:r>
-        <w:t>T</w:t>
-      </w:r>
-      <w:r>
-        <w:t>he Secure Product Catalog API is a REST API built with Express and TypeScript. It provides product CRUD operations and demonstrates centralized error handling, request validation, security middleware, HTTP request logging, and rate limiting.</w:t>
+        <w:t>The Secure Product Catalog API is a REST API built with Express and TypeScript. It provides product CRUD operations and demonstrates centralized error handling, request validation, security middleware, HTTP request logging, and rate limiting.</w:t>
       </w:r>
     </w:p>
     <w:p>
@@ -761,6 +758,7 @@
             <w:r>
               <w:rPr>
                 <w:i/>
+                <w:noProof/>
                 <w:color w:val="646464"/>
               </w:rPr>
               <w:drawing>
@@ -855,6 +853,9 @@
               <w:jc w:val="center"/>
             </w:pPr>
             <w:r>
+              <w:rPr>
+                <w:noProof/>
+              </w:rPr>
               <w:drawing>
                 <wp:inline distT="0" distB="0" distL="0" distR="0" wp14:anchorId="41AC6B5B" wp14:editId="2FBB5104">
                   <wp:extent cx="5887048" cy="4602480"/>
@@ -984,6 +985,9 @@
               <w:jc w:val="center"/>
             </w:pPr>
             <w:r>
+              <w:rPr>
+                <w:noProof/>
+              </w:rPr>
               <w:lastRenderedPageBreak/>
               <w:drawing>
                 <wp:inline distT="0" distB="0" distL="0" distR="0" wp14:anchorId="6EC29B2B" wp14:editId="60843307">
@@ -1068,6 +1072,9 @@
               <w:jc w:val="center"/>
             </w:pPr>
             <w:r>
+              <w:rPr>
+                <w:noProof/>
+              </w:rPr>
               <w:lastRenderedPageBreak/>
               <w:drawing>
                 <wp:inline distT="0" distB="0" distL="0" distR="0" wp14:anchorId="4778F8F3" wp14:editId="5722C0FC">
@@ -1152,6 +1159,9 @@
               <w:jc w:val="center"/>
             </w:pPr>
             <w:r>
+              <w:rPr>
+                <w:noProof/>
+              </w:rPr>
               <w:lastRenderedPageBreak/>
               <w:drawing>
                 <wp:inline distT="0" distB="0" distL="0" distR="0" wp14:anchorId="3058A87B" wp14:editId="54B0B8F5">
@@ -1252,6 +1262,9 @@
               <w:spacing w:before="500" w:after="500"/>
             </w:pPr>
             <w:r>
+              <w:rPr>
+                <w:noProof/>
+              </w:rPr>
               <w:drawing>
                 <wp:inline distT="0" distB="0" distL="0" distR="0" wp14:anchorId="129CF823" wp14:editId="0FB2858F">
                   <wp:extent cx="6050280" cy="2640552"/>
@@ -1330,6 +1343,9 @@
               <w:jc w:val="center"/>
             </w:pPr>
             <w:r>
+              <w:rPr>
+                <w:noProof/>
+              </w:rPr>
               <w:drawing>
                 <wp:inline distT="0" distB="0" distL="0" distR="0" wp14:anchorId="276F2716" wp14:editId="39501CB7">
                   <wp:extent cx="5744210" cy="5273040"/>
@@ -1408,6 +1424,9 @@
               <w:jc w:val="center"/>
             </w:pPr>
             <w:r>
+              <w:rPr>
+                <w:noProof/>
+              </w:rPr>
               <w:lastRenderedPageBreak/>
               <w:drawing>
                 <wp:inline distT="0" distB="0" distL="0" distR="0" wp14:anchorId="220FEFC4" wp14:editId="586DF005">
@@ -1487,6 +1506,9 @@
               <w:jc w:val="center"/>
             </w:pPr>
             <w:r>
+              <w:rPr>
+                <w:noProof/>
+              </w:rPr>
               <w:lastRenderedPageBreak/>
               <w:drawing>
                 <wp:inline distT="0" distB="0" distL="0" distR="0" wp14:anchorId="5345805A" wp14:editId="2BEE8910">
@@ -1580,6 +1602,9 @@
               <w:spacing w:before="500" w:after="500"/>
             </w:pPr>
             <w:r>
+              <w:rPr>
+                <w:noProof/>
+              </w:rPr>
               <w:lastRenderedPageBreak/>
               <w:drawing>
                 <wp:inline distT="0" distB="0" distL="0" distR="0" wp14:anchorId="2965285A" wp14:editId="2D02EC07">
@@ -1672,6 +1697,9 @@
               <w:jc w:val="center"/>
             </w:pPr>
             <w:r>
+              <w:rPr>
+                <w:noProof/>
+              </w:rPr>
               <w:lastRenderedPageBreak/>
               <w:drawing>
                 <wp:inline distT="0" distB="0" distL="0" distR="0" wp14:anchorId="67C2B4BF" wp14:editId="339D0191">
@@ -1751,6 +1779,9 @@
               <w:jc w:val="center"/>
             </w:pPr>
             <w:r>
+              <w:rPr>
+                <w:noProof/>
+              </w:rPr>
               <w:drawing>
                 <wp:inline distT="0" distB="0" distL="0" distR="0" wp14:anchorId="2CA0643B" wp14:editId="02C3C399">
                   <wp:extent cx="6292399" cy="2827020"/>
@@ -1820,6 +1851,9 @@
               <w:jc w:val="center"/>
             </w:pPr>
             <w:r>
+              <w:rPr>
+                <w:noProof/>
+              </w:rPr>
               <w:drawing>
                 <wp:inline distT="0" distB="0" distL="0" distR="0" wp14:anchorId="5485D399" wp14:editId="2D1364D5">
                   <wp:extent cx="6309360" cy="1606550"/>
@@ -1897,6 +1931,9 @@
               <w:spacing w:before="500" w:after="500"/>
             </w:pPr>
             <w:r>
+              <w:rPr>
+                <w:noProof/>
+              </w:rPr>
               <w:drawing>
                 <wp:inline distT="0" distB="0" distL="0" distR="0" wp14:anchorId="0DDD837B" wp14:editId="271EDA1D">
                   <wp:extent cx="6309360" cy="2971800"/>
@@ -1980,6 +2017,9 @@
               <w:jc w:val="center"/>
             </w:pPr>
             <w:r>
+              <w:rPr>
+                <w:noProof/>
+              </w:rPr>
               <w:lastRenderedPageBreak/>
               <w:drawing>
                 <wp:inline distT="0" distB="0" distL="0" distR="0" wp14:anchorId="3E99792B" wp14:editId="20CA3F6A">
@@ -2044,7 +2084,7 @@
       <w:tr>
         <w:tc>
           <w:tcPr>
-            <w:tcW w:w="3312" w:type="dxa"/>
+            <w:tcW w:w="3308" w:type="dxa"/>
             <w:shd w:val="clear" w:color="auto" w:fill="1F4E79"/>
             <w:vAlign w:val="center"/>
           </w:tcPr>
@@ -2060,7 +2100,7 @@
         </w:tc>
         <w:tc>
           <w:tcPr>
-            <w:tcW w:w="3312" w:type="dxa"/>
+            <w:tcW w:w="3309" w:type="dxa"/>
             <w:shd w:val="clear" w:color="auto" w:fill="1F4E79"/>
             <w:vAlign w:val="center"/>
           </w:tcPr>
@@ -2076,7 +2116,7 @@
         </w:tc>
         <w:tc>
           <w:tcPr>
-            <w:tcW w:w="3312" w:type="dxa"/>
+            <w:tcW w:w="3309" w:type="dxa"/>
             <w:shd w:val="clear" w:color="auto" w:fill="1F4E79"/>
             <w:vAlign w:val="center"/>
           </w:tcPr>
@@ -2094,7 +2134,7 @@
       <w:tr>
         <w:tc>
           <w:tcPr>
-            <w:tcW w:w="3312" w:type="dxa"/>
+            <w:tcW w:w="3308" w:type="dxa"/>
             <w:vAlign w:val="center"/>
           </w:tcPr>
           <w:p>
@@ -2105,7 +2145,7 @@
         </w:tc>
         <w:tc>
           <w:tcPr>
-            <w:tcW w:w="3312" w:type="dxa"/>
+            <w:tcW w:w="3309" w:type="dxa"/>
             <w:vAlign w:val="center"/>
           </w:tcPr>
           <w:p>
@@ -2116,7 +2156,7 @@
         </w:tc>
         <w:tc>
           <w:tcPr>
-            <w:tcW w:w="3312" w:type="dxa"/>
+            <w:tcW w:w="3309" w:type="dxa"/>
             <w:vAlign w:val="center"/>
           </w:tcPr>
           <w:p>
@@ -2129,7 +2169,7 @@
       <w:tr>
         <w:tc>
           <w:tcPr>
-            <w:tcW w:w="3312" w:type="dxa"/>
+            <w:tcW w:w="3308" w:type="dxa"/>
             <w:vAlign w:val="center"/>
           </w:tcPr>
           <w:p>
@@ -2140,7 +2180,7 @@
         </w:tc>
         <w:tc>
           <w:tcPr>
-            <w:tcW w:w="3312" w:type="dxa"/>
+            <w:tcW w:w="3309" w:type="dxa"/>
             <w:vAlign w:val="center"/>
           </w:tcPr>
           <w:p>
@@ -2151,7 +2191,7 @@
         </w:tc>
         <w:tc>
           <w:tcPr>
-            <w:tcW w:w="3312" w:type="dxa"/>
+            <w:tcW w:w="3309" w:type="dxa"/>
             <w:vAlign w:val="center"/>
           </w:tcPr>
           <w:p>
@@ -2164,7 +2204,7 @@
       <w:tr>
         <w:tc>
           <w:tcPr>
-            <w:tcW w:w="3312" w:type="dxa"/>
+            <w:tcW w:w="3308" w:type="dxa"/>
             <w:vAlign w:val="center"/>
           </w:tcPr>
           <w:p>
@@ -2175,7 +2215,7 @@
         </w:tc>
         <w:tc>
           <w:tcPr>
-            <w:tcW w:w="3312" w:type="dxa"/>
+            <w:tcW w:w="3309" w:type="dxa"/>
             <w:vAlign w:val="center"/>
           </w:tcPr>
           <w:p>
@@ -2186,7 +2226,7 @@
         </w:tc>
         <w:tc>
           <w:tcPr>
-            <w:tcW w:w="3312" w:type="dxa"/>
+            <w:tcW w:w="3309" w:type="dxa"/>
             <w:vAlign w:val="center"/>
           </w:tcPr>
           <w:p>
@@ -2199,7 +2239,7 @@
       <w:tr>
         <w:tc>
           <w:tcPr>
-            <w:tcW w:w="3312" w:type="dxa"/>
+            <w:tcW w:w="3308" w:type="dxa"/>
             <w:vAlign w:val="center"/>
           </w:tcPr>
           <w:p>
@@ -2210,7 +2250,7 @@
         </w:tc>
         <w:tc>
           <w:tcPr>
-            <w:tcW w:w="3312" w:type="dxa"/>
+            <w:tcW w:w="3309" w:type="dxa"/>
             <w:vAlign w:val="center"/>
           </w:tcPr>
           <w:p>
@@ -2221,7 +2261,7 @@
         </w:tc>
         <w:tc>
           <w:tcPr>
-            <w:tcW w:w="3312" w:type="dxa"/>
+            <w:tcW w:w="3309" w:type="dxa"/>
             <w:vAlign w:val="center"/>
           </w:tcPr>
           <w:p>
@@ -2234,7 +2274,7 @@
       <w:tr>
         <w:tc>
           <w:tcPr>
-            <w:tcW w:w="3312" w:type="dxa"/>
+            <w:tcW w:w="3308" w:type="dxa"/>
             <w:vAlign w:val="center"/>
           </w:tcPr>
           <w:p>
@@ -2245,7 +2285,7 @@
         </w:tc>
         <w:tc>
           <w:tcPr>
-            <w:tcW w:w="3312" w:type="dxa"/>
+            <w:tcW w:w="3309" w:type="dxa"/>
             <w:vAlign w:val="center"/>
           </w:tcPr>
           <w:p>
@@ -2256,7 +2296,7 @@
         </w:tc>
         <w:tc>
           <w:tcPr>
-            <w:tcW w:w="3312" w:type="dxa"/>
+            <w:tcW w:w="3309" w:type="dxa"/>
             <w:vAlign w:val="center"/>
           </w:tcPr>
           <w:p>
@@ -2269,7 +2309,7 @@
       <w:tr>
         <w:tc>
           <w:tcPr>
-            <w:tcW w:w="3312" w:type="dxa"/>
+            <w:tcW w:w="3308" w:type="dxa"/>
             <w:vAlign w:val="center"/>
           </w:tcPr>
           <w:p>
@@ -2280,7 +2320,7 @@
         </w:tc>
         <w:tc>
           <w:tcPr>
-            <w:tcW w:w="3312" w:type="dxa"/>
+            <w:tcW w:w="3309" w:type="dxa"/>
             <w:vAlign w:val="center"/>
           </w:tcPr>
           <w:p>
@@ -2291,7 +2331,7 @@
         </w:tc>
         <w:tc>
           <w:tcPr>
-            <w:tcW w:w="3312" w:type="dxa"/>
+            <w:tcW w:w="3309" w:type="dxa"/>
             <w:vAlign w:val="center"/>
           </w:tcPr>
           <w:p>
@@ -2304,7 +2344,7 @@
       <w:tr>
         <w:tc>
           <w:tcPr>
-            <w:tcW w:w="3312" w:type="dxa"/>
+            <w:tcW w:w="3308" w:type="dxa"/>
             <w:vAlign w:val="center"/>
           </w:tcPr>
           <w:p>
@@ -2316,7 +2356,7 @@
         </w:tc>
         <w:tc>
           <w:tcPr>
-            <w:tcW w:w="3312" w:type="dxa"/>
+            <w:tcW w:w="3309" w:type="dxa"/>
             <w:vAlign w:val="center"/>
           </w:tcPr>
           <w:p>
@@ -2327,7 +2367,7 @@
         </w:tc>
         <w:tc>
           <w:tcPr>
-            <w:tcW w:w="3312" w:type="dxa"/>
+            <w:tcW w:w="3309" w:type="dxa"/>
             <w:vAlign w:val="center"/>
           </w:tcPr>
           <w:p>
@@ -2340,7 +2380,7 @@
       <w:tr>
         <w:tc>
           <w:tcPr>
-            <w:tcW w:w="3312" w:type="dxa"/>
+            <w:tcW w:w="3308" w:type="dxa"/>
             <w:vAlign w:val="center"/>
           </w:tcPr>
           <w:p>
@@ -2351,7 +2391,7 @@
         </w:tc>
         <w:tc>
           <w:tcPr>
-            <w:tcW w:w="3312" w:type="dxa"/>
+            <w:tcW w:w="3309" w:type="dxa"/>
             <w:vAlign w:val="center"/>
           </w:tcPr>
           <w:p>
@@ -2362,7 +2402,7 @@
         </w:tc>
         <w:tc>
           <w:tcPr>
-            <w:tcW w:w="3312" w:type="dxa"/>
+            <w:tcW w:w="3309" w:type="dxa"/>
             <w:vAlign w:val="center"/>
           </w:tcPr>
           <w:p>
@@ -2373,6 +2413,90 @@
         </w:tc>
       </w:tr>
     </w:tbl>
+    <w:p>
+      <w:pPr>
+        <w:pStyle w:val="Heading1"/>
+      </w:pPr>
+      <w:r>
+        <w:drawing>
+          <wp:inline distT="0" distB="0" distL="0" distR="0" wp14:anchorId="563BB71E" wp14:editId="61E2E56C">
+            <wp:extent cx="6309360" cy="3577590"/>
+            <wp:effectExtent l="0" t="0" r="0" b="3810"/>
+            <wp:docPr id="993402591" name="Picture 1"/>
+            <wp:cNvGraphicFramePr>
+              <a:graphicFrameLocks xmlns:a="http://schemas.openxmlformats.org/drawingml/2006/main" noChangeAspect="1"/>
+            </wp:cNvGraphicFramePr>
+            <a:graphic xmlns:a="http://schemas.openxmlformats.org/drawingml/2006/main">
+              <a:graphicData uri="http://schemas.openxmlformats.org/drawingml/2006/picture">
+                <pic:pic xmlns:pic="http://schemas.openxmlformats.org/drawingml/2006/picture">
+                  <pic:nvPicPr>
+                    <pic:cNvPr id="993402591" name=""/>
+                    <pic:cNvPicPr/>
+                  </pic:nvPicPr>
+                  <pic:blipFill>
+                    <a:blip r:embed="rId21"/>
+                    <a:stretch>
+                      <a:fillRect/>
+                    </a:stretch>
+                  </pic:blipFill>
+                  <pic:spPr>
+                    <a:xfrm>
+                      <a:off x="0" y="0"/>
+                      <a:ext cx="6309360" cy="3577590"/>
+                    </a:xfrm>
+                    <a:prstGeom prst="rect">
+                      <a:avLst/>
+                    </a:prstGeom>
+                  </pic:spPr>
+                </pic:pic>
+              </a:graphicData>
+            </a:graphic>
+          </wp:inline>
+        </w:drawing>
+      </w:r>
+    </w:p>
+    <w:p>
+      <w:pPr>
+        <w:pStyle w:val="Heading1"/>
+      </w:pPr>
+      <w:r>
+        <w:drawing>
+          <wp:inline distT="0" distB="0" distL="0" distR="0" wp14:anchorId="1E390AF9" wp14:editId="228C49E7">
+            <wp:extent cx="6309360" cy="2446020"/>
+            <wp:effectExtent l="0" t="0" r="0" b="0"/>
+            <wp:docPr id="2061449884" name="Picture 1"/>
+            <wp:cNvGraphicFramePr>
+              <a:graphicFrameLocks xmlns:a="http://schemas.openxmlformats.org/drawingml/2006/main" noChangeAspect="1"/>
+            </wp:cNvGraphicFramePr>
+            <a:graphic xmlns:a="http://schemas.openxmlformats.org/drawingml/2006/main">
+              <a:graphicData uri="http://schemas.openxmlformats.org/drawingml/2006/picture">
+                <pic:pic xmlns:pic="http://schemas.openxmlformats.org/drawingml/2006/picture">
+                  <pic:nvPicPr>
+                    <pic:cNvPr id="2061449884" name=""/>
+                    <pic:cNvPicPr/>
+                  </pic:nvPicPr>
+                  <pic:blipFill>
+                    <a:blip r:embed="rId22"/>
+                    <a:stretch>
+                      <a:fillRect/>
+                    </a:stretch>
+                  </pic:blipFill>
+                  <pic:spPr>
+                    <a:xfrm>
+                      <a:off x="0" y="0"/>
+                      <a:ext cx="6309360" cy="2446020"/>
+                    </a:xfrm>
+                    <a:prstGeom prst="rect">
+                      <a:avLst/>
+                    </a:prstGeom>
+                  </pic:spPr>
+                </pic:pic>
+              </a:graphicData>
+            </a:graphic>
+          </wp:inline>
+        </w:drawing>
+      </w:r>
+    </w:p>
     <w:p>
       <w:pPr>
         <w:pStyle w:val="Heading1"/>
@@ -2391,105 +2515,71 @@
         <w:pStyle w:val="Heading1"/>
       </w:pPr>
       <w:r>
+        <w:lastRenderedPageBreak/>
         <w:t>Screenshot Checklist</w:t>
       </w:r>
     </w:p>
     <w:p>
       <w:r>
-        <w:t>☐</w:t>
-      </w:r>
-      <w:r>
-        <w:t xml:space="preserve"> GET all products — 200</w:t>
+        <w:t>☐ GET all products — 200</w:t>
       </w:r>
     </w:p>
     <w:p>
       <w:r>
-        <w:t>☐</w:t>
-      </w:r>
-      <w:r>
-        <w:t xml:space="preserve"> GET product by ID — 200</w:t>
+        <w:t>☐ GET product by ID — 200</w:t>
       </w:r>
     </w:p>
     <w:p>
       <w:r>
-        <w:t>☐</w:t>
-      </w:r>
-      <w:r>
-        <w:t xml:space="preserve"> POST valid product — 201</w:t>
+        <w:t>☐ POST valid product — 201</w:t>
       </w:r>
     </w:p>
     <w:p>
       <w:r>
-        <w:t>☐</w:t>
-      </w:r>
-      <w:r>
-        <w:t xml:space="preserve"> POST invalid data — 422</w:t>
+        <w:t>☐ POST invalid data — 422</w:t>
       </w:r>
     </w:p>
     <w:p>
       <w:r>
-        <w:t>☐</w:t>
-      </w:r>
-      <w:r>
-        <w:t xml:space="preserve"> PUT update — 200</w:t>
+        <w:t>☐ PUT update — 200</w:t>
       </w:r>
     </w:p>
     <w:p>
       <w:r>
-        <w:t>☐</w:t>
-      </w:r>
-      <w:r>
-        <w:t xml:space="preserve"> DELETE valid product — 204</w:t>
+        <w:t>☐ DELETE valid product — 204</w:t>
       </w:r>
     </w:p>
     <w:p>
       <w:r>
-        <w:t>☐</w:t>
-      </w:r>
-      <w:r>
-        <w:t xml:space="preserve"> Missing product / unknown route — 404</w:t>
+        <w:t>☐ Missing product / unknown route — 404</w:t>
       </w:r>
     </w:p>
     <w:p>
       <w:r>
-        <w:t>☐</w:t>
-      </w:r>
-      <w:r>
-        <w:t xml:space="preserve"> Temporary /test-error route — 500</w:t>
+        <w:t>☐ Temporary /test-error route — 500</w:t>
       </w:r>
     </w:p>
     <w:p>
       <w:r>
-        <w:t>☐</w:t>
-      </w:r>
-      <w:r>
-        <w:t xml:space="preserve"> Rate-limit run showing 429</w:t>
+        <w:t>☐ Rate-limit run showing 429</w:t>
       </w:r>
     </w:p>
     <w:p>
       <w:r>
-        <w:t>☐</w:t>
-      </w:r>
-      <w:r>
-        <w:t xml:space="preserve"> Morgan logs in terminal</w:t>
+        <w:t>☐ Morgan logs in terminal</w:t>
       </w:r>
     </w:p>
     <w:p>
       <w:r>
-        <w:t>☐</w:t>
-      </w:r>
-      <w:r>
-        <w:t xml:space="preserve"> Winston combined.log and error.log files and contents</w:t>
+        <w:t>☐ Winston combined.log and error.log files and contents</w:t>
       </w:r>
     </w:p>
     <w:p>
       <w:r>
-        <w:t>☐</w:t>
-      </w:r>
-      <w:r>
-        <w:t xml:space="preserve"> Large request body test, if required</w:t>
+        <w:t>☐ Large request body test, if required</w:t>
       </w:r>
     </w:p>
+    <w:p/>
     <w:sectPr>
       <w:pgSz w:w="12240" w:h="15840"/>
       <w:pgMar w:top="1008" w:right="1152" w:bottom="1008" w:left="1152" w:header="720" w:footer="720" w:gutter="0"/>

</xml_diff>